<commit_message>
I added full baseline architecture documentation across FRONTEND_CHANGES and BACKEND_CHANGES files for Notari (local).
</commit_message>
<xml_diff>
--- a/BACKEND_CHANGES.docx
+++ b/BACKEND_CHANGES.docx
@@ -7,29 +7,81 @@
         <w:pStyle w:val="Title"/>
       </w:pPr>
       <w:r>
-        <w:t>Notari (local) - Backend Change Log</w:t>
+        <w:t>Notari (local) - Backend Architecture &amp; Change Log</w:t>
       </w:r>
     </w:p>
     <w:p>
       <w:r>
-        <w:rPr>
-          <w:b/>
-        </w:rPr>
-        <w:t>Change 1: Initial Baseline Setup and Repository Integration</w:t>
+        <w:t>Repository: https://github.com/hemantrillion/Notari-local---Tag-driven-archive-and-search-engine</w:t>
+      </w:r>
+    </w:p>
+    <w:p>
+      <w:pPr>
+        <w:pStyle w:val="Heading1"/>
+      </w:pPr>
+      <w:r>
+        <w:t>1. Server Architecture &amp; Routing</w:t>
       </w:r>
     </w:p>
     <w:p>
       <w:r>
-        <w:t>Goal: I wanted to initialize the backend server structure, audit log tracking system, and link repository storage for Notari (local).</w:t>
+        <w:t>server.js: Express application server running on port 5005. Configured with CORS, JSON body parsers, and API route controllers.</w:t>
+      </w:r>
+    </w:p>
+    <w:p>
+      <w:pPr>
+        <w:pStyle w:val="Heading1"/>
+      </w:pPr>
+      <w:r>
+        <w:t>2. Database Storage &amp; URL ID (readableCode)</w:t>
       </w:r>
     </w:p>
     <w:p>
       <w:r>
-        <w:t>Actions:</w:t>
-        <w:br/>
-        <w:t>- Initialized Express server routing under backend/src/server.js with modular endpoints for links, tags, sources, and audit logs.</w:t>
-        <w:br/>
-        <w:t>- Verified local database storage schema in backend/links.json to handle untagged/tagged link objects and system audit logs.</w:t>
+        <w:t>links.json &amp; db.js: Local database storage holding links, tagRegistry, sourceRegistry, and auditLogs arrays.</w:t>
+      </w:r>
+    </w:p>
+    <w:p>
+      <w:r>
+        <w:t>URL ID (urlId / readableCode): Unique readable identifier generated from link metadata (source, tag, timestamp). Untagged links default to tag code 0000.</w:t>
+      </w:r>
+    </w:p>
+    <w:p>
+      <w:pPr>
+        <w:pStyle w:val="Heading1"/>
+      </w:pPr>
+      <w:r>
+        <w:t>3. Backend Services &amp; Modules</w:t>
+      </w:r>
+    </w:p>
+    <w:p>
+      <w:r>
+        <w:t>links.service.js: Core service handling link creation from share intent, tag updates, untagged queue, and Webpage content storage.</w:t>
+      </w:r>
+    </w:p>
+    <w:p>
+      <w:r>
+        <w:t>tags.service.js: Service managing tag creation, renaming, code assignment, and deletion.</w:t>
+      </w:r>
+    </w:p>
+    <w:p>
+      <w:r>
+        <w:t>sources.service.js: Service managing origin platforms (Instagram, Telegram, YouTube, etc.).</w:t>
+      </w:r>
+    </w:p>
+    <w:p>
+      <w:r>
+        <w:t>search.service.js: Query engine filtering saved Webpages by single or multi-tag combinations.</w:t>
+      </w:r>
+    </w:p>
+    <w:p>
+      <w:r>
+        <w:t>[Currently stable - don't touch] audit-logs.service.js: Service recording all CRUD operations into auditLogs array with timestamps and field-level diffs.</w:t>
+      </w:r>
+    </w:p>
+    <w:p>
+      <w:r>
+        <w:t>proxy.routes.js &amp; youtube.routes.js: Backend routes fetching external web page previews and YouTube search API data.</w:t>
       </w:r>
     </w:p>
     <w:sectPr>

</xml_diff>